<commit_message>
Final: Stage 4.5 PASS on v10, submission package (00-08) rebuilt, Stage 6 addendum; repository cleaned to the final record
Intermediate ARS stage artifacts, correction rounds and drafts v1-v9 removed from the
working tree at the author's request (kept in history). ars/ now holds the final
manuscript, integrity reports, process record and the package build scripts.

Co-Authored-By: Claude Opus 5.5 <noreply@anthropic.com>
Claude-Session: https://claude.ai/code/session_01H9iHZGmP6JhCq5jxPGTAWf
</commit_message>
<xml_diff>
--- a/submission/02_Manuscript_Anonymized.docx
+++ b/submission/02_Manuscript_Anonymized.docx
@@ -200,7 +200,7 @@
         <w:pStyle w:val="FirstParagraph"/>
       </w:pPr>
       <w:r>
-        <w:t xml:space="preserve">Reclassification moves a whole market between benchmark families. Because mutual funds allocate across countries with reference to benchmark weights, a change in classification changes capital flows (Raddatz et al., 2017) and can move currency values (Hau et al., 2010). Burnham et al. (2018) show that, when MSCI moves a country to a different index family, its stock prices move sharply in the direction implied by the new benchmark before implementation and give back most of that move in the following year. After MSCI included China A-shares in its Emerging Markets Index, the included stocks earned abnormal returns around the announcement, and market quality changed over the longer run through liquidity, turnover and price synchronization (Dong et al., 2023); beyond that study, we did not locate a stock-level study of liquidity around the China A-share inclusion. Frontier-market evidence is thinner. Biktimirov and Afego (2026) study changes to the FTSE Frontier 50 Index from 2008 to 2025; they find persistent price gains for additions and distinct return and trading-volume responses when a country changes class, and they trace the gains to institutional demand rather than to trading pressure or liquidity.</w:t>
+        <w:t xml:space="preserve">Reclassification moves a whole market between benchmark families. Because mutual funds allocate across countries with reference to benchmark weights, a change in classification changes capital flows (Raddatz et al., 2017) and can move currency values (Hau et al., 2010). Burnham et al. (2018) show that, when MSCI moves a country to a different index family, its stock prices move sharply in the direction implied by the new benchmark before implementation and give back most of that move in the following year. After MSCI included China A-shares in its Emerging Markets Index, the included stocks earned abnormal returns around the announcement, and market quality changed over the longer run through liquidity, turnover and price synchronization (Dong et al., 2023); beyond that study, we did not locate a stock-level study of liquidity around the China A-share inclusion. Frontier-market evidence is thinner. Biktimirov and Afego (2026) study changes to the FTSE Frontier 50 Index from 2008 to 2025; they find persistent price gains for additions and returns and trading volume that respond differently when a country changes class, and they trace the gains to institutional demand rather than to trading pressure or liquidity.</w:t>
       </w:r>
     </w:p>
     <w:p>
@@ -6485,7 +6485,7 @@
         <w:t xml:space="preserve">Notes</w:t>
       </w:r>
       <w:r>
-        <w:t xml:space="preserve">: Log Amihud unless stated; the split rows come from one regression, and other details are as in Table 2. Source: Authors’ calculations.</w:t>
+        <w:t xml:space="preserve">: Log Amihud unless stated; the split rows come from one regression with never-named, never-included controls, and other details are as in Table 2. Source: Authors’ calculations.</w:t>
       </w:r>
     </w:p>
     <w:p>
@@ -6516,7 +6516,7 @@
         <w:t xml:space="preserve"> </w:t>
       </w:r>
       <w:r>
-        <w:t xml:space="preserve">of Eq. (8). Before the announcement, the constituent coefficients show no downward drift and are positive in several months, largest three and two months before it (0.33 and 0.23). Because these deviations are precisely estimated, the joint pre-trend test rejects in the full sample (</w:t>
+        <w:t xml:space="preserve">of Eq. (8). Before the announcement, the constituent coefficients show no downward drift and are positive in several months, significantly so three and two months before it (0.33 and 0.23). Because these deviations are precisely estimated, the joint pre-trend test rejects in the full sample (</w:t>
       </w:r>
       <w:r>
         <w:rPr>
@@ -6703,7 +6703,7 @@
         <w:t xml:space="preserve"> </w:t>
       </w:r>
       <w:r>
-        <w:t xml:space="preserve">of Eq. (8) with 95% confidence intervals (panel A: log Amihud; panel B: log trading value); dashed lines mark the announcement, confirmation and list months. Source: Authors’ calculations.</w:t>
+        <w:t xml:space="preserve">of Eq. (8), estimated jointly with the same month interactions for named-but-excluded stocks, with 95% confidence intervals (panel A: log Amihud; panel B: log trading value); dashed lines mark the announcement, confirmation and list months. Source: Authors’ calculations.</w:t>
       </w:r>
     </w:p>
     <w:p>
@@ -6898,10 +6898,7 @@
         </m:sSub>
       </m:oMath>
       <w:r>
-        <w:t xml:space="preserve"> </w:t>
-      </w:r>
-      <w:r>
-        <w:t xml:space="preserve">and 95% confidence intervals; dashed lines as in Figure 1. Source: Authors’ calculations.</w:t>
+        <w:t xml:space="preserve">, never-named, never-included controls and 95% confidence intervals; dashed lines as in Figure 1. Source: Authors’ calculations.</w:t>
       </w:r>
     </w:p>
     <w:p>
@@ -9404,7 +9401,7 @@
         <w:t xml:space="preserve">Notes</w:t>
       </w:r>
       <w:r>
-        <w:t xml:space="preserve">: Eq. (7) with segment-by-window interactions; the last row reports the mean (standard error), and significance marks are omitted for the three-stock segments. Source: Authors’ calculations.</w:t>
+        <w:t xml:space="preserve">: Eq. (7) with segment-by-window interactions; the last row reports the mean (standard error), significance marks are omitted for the three-stock segments and the last row, and other details are as in Table 2. Source: Authors’ calculations.</w:t>
       </w:r>
     </w:p>
     <w:bookmarkEnd w:id="41"/>
@@ -9949,7 +9946,7 @@
         <w:t xml:space="preserve"> </w:t>
       </w:r>
       <w:r>
-        <w:t xml:space="preserve">from Eq. (4) and spreads in decimal units (0.0010 = 0.10 percentage points). Source: Authors’ calculations.</w:t>
+        <w:t xml:space="preserve">from Eq. (4), spreads in decimal units (0.0010 = 0.10 percentage points) and other details as in Table 2. Source: Authors’ calculations.</w:t>
       </w:r>
     </w:p>
     <w:bookmarkEnd w:id="42"/>
@@ -10778,7 +10775,7 @@
         <w:t xml:space="preserve">Notes</w:t>
       </w:r>
       <w:r>
-        <w:t xml:space="preserve">: Dependent variable log Amihud; the excluded stocks and the inference settings are given in Sections 3.3 and 5.1. Source: Authors’ calculations.</w:t>
+        <w:t xml:space="preserve">: Dependent variable log Amihud; the excluded stocks and the inference settings (one-sided randomization inference) are given in Sections 3.3 and 5.1, and other details are as in Table 2. Source: Authors’ calculations.</w:t>
       </w:r>
     </w:p>
     <w:p>
@@ -11418,7 +11415,7 @@
         <w:t xml:space="preserve">Notes</w:t>
       </w:r>
       <w:r>
-        <w:t xml:space="preserve">: One regression per panel on all 366 stocks, relative to never-named stocks, with point estimates only for the two-stock row; other details as in Table 2. Source: Authors’ calculations.</w:t>
+        <w:t xml:space="preserve">: One regression per panel on all 366 stocks, relative to never-named stocks, with S1–S3 as defined in Section 5.2, point estimates only for the two-stock row and other details as in Table 2. Source: Authors’ calculations.</w:t>
       </w:r>
     </w:p>
     <w:p>
@@ -11453,7 +11450,7 @@
         <w:pStyle w:val="BodyText"/>
       </w:pPr>
       <w:r>
-        <w:t xml:space="preserve">These findings favour the recognition channel over the price-pressure channel as the source of lasting effects: prices and liquidity moved with FTSE’s public statements rather than with the first-tranche rebalancing. This reading fits developed-market studies that find lasting liquidity gains after inclusion (Hegde &amp; McDermott, 2003) and frontier-market evidence that index effects reflect investor demand rather than liquidity alone (Biktimirov &amp; Afego, 2026); in Vietnam, prices and liquidity moved together at disclosure. Unlike a routine reconstitution, the Vietnamese upgrade changed which benchmark family could hold the stocks, and FTSE announced it months in advance.</w:t>
+        <w:t xml:space="preserve">These findings favour the recognition channel over the price-pressure channel as the source of lasting effects: prices and liquidity moved with FTSE’s public statements, and the first-tranche rebalancing brought a trading surge but no reliable price effect. This reading fits developed-market studies that find lasting liquidity gains after inclusion (Hegde &amp; McDermott, 2003) and frontier-market evidence that index effects reflect investor demand rather than liquidity alone (Biktimirov &amp; Afego, 2026); in Vietnam, prices and liquidity moved together at disclosure. Unlike a routine reconstitution, the Vietnamese upgrade changed which benchmark family could hold the stocks, and FTSE announced it months in advance.</w:t>
       </w:r>
     </w:p>
     <w:p>
@@ -12091,7 +12088,7 @@
         <w:t xml:space="preserve">Notes</w:t>
       </w:r>
       <w:r>
-        <w:t xml:space="preserve">: Pre-period means and standardized mean differences (SMD); log price and volatility stay above 0.10 after matching, so the matched estimates are paired with the size-by-week and trend specifications. Source: Authors’ calculations.</w:t>
+        <w:t xml:space="preserve">: Pre-period means (log trading value is the mean daily log of 1 plus traded value in VND billion) and standardized mean differences (SMD); log price and volatility stay above 0.10 after matching, so the matched estimates are paired with the size-by-week and trend specifications. Source: Authors’ calculations.</w:t>
       </w:r>
     </w:p>
     <w:p>
@@ -13066,7 +13063,7 @@
         <w:t xml:space="preserve">Notes</w:t>
       </w:r>
       <w:r>
-        <w:t xml:space="preserve">: Change in mean log Amihud relative to never-named stocks and to the pre-announcement level of the stock, with S1–S3 as in Table 9. Source: Authors’ calculations.</w:t>
+        <w:t xml:space="preserve">: Change in mean log Amihud relative to never-named stocks and to the pre-announcement level of the stock, with S1–S3 as defined in Section 5.2. Source: Authors’ calculations.</w:t>
       </w:r>
     </w:p>
     <w:bookmarkEnd w:id="48"/>

</xml_diff>